<commit_message>
Rebuild Auto-Bid PRD with professional light-mode diagrams
Replaced all dark-mode mockup screenshots with professional light-mode
wireframes: white backgrounds, navy accent (#1e3e78), subtle borders,
no emojis or icons in any diagram. All 8 figures updated — Live Auctions
tab, setup panels (closed and open), Bidder Battle, Simulator, notification
types, session state machine, and user journey timeline.

Co-Authored-By: Claude Sonnet 4.6 <noreply@anthropic.com>
</commit_message>
<xml_diff>
--- a/doc/ediig-auto-bid-prd.docx
+++ b/doc/ediig-auto-bid-prd.docx
@@ -3481,7 +3481,7 @@
       <w:r>
         <w:drawing>
           <wp:inline xmlns:a="http://schemas.openxmlformats.org/drawingml/2006/main" xmlns:pic="http://schemas.openxmlformats.org/drawingml/2006/picture">
-            <wp:extent cx="5303520" cy="4164659"/>
+            <wp:extent cx="5303520" cy="4329404"/>
             <wp:docPr id="1" name="Picture 1"/>
             <wp:cNvGraphicFramePr>
               <a:graphicFrameLocks noChangeAspect="1"/>
@@ -3502,7 +3502,7 @@
                   <pic:spPr>
                     <a:xfrm>
                       <a:off x="0" y="0"/>
-                      <a:ext cx="5303520" cy="4164659"/>
+                      <a:ext cx="5303520" cy="4329404"/>
                     </a:xfrm>
                     <a:prstGeom prst="rect"/>
                   </pic:spPr>
@@ -3667,7 +3667,7 @@
       <w:r>
         <w:drawing>
           <wp:inline xmlns:a="http://schemas.openxmlformats.org/drawingml/2006/main" xmlns:pic="http://schemas.openxmlformats.org/drawingml/2006/picture">
-            <wp:extent cx="5303520" cy="5099538"/>
+            <wp:extent cx="5303520" cy="5067167"/>
             <wp:docPr id="2" name="Picture 2"/>
             <wp:cNvGraphicFramePr>
               <a:graphicFrameLocks noChangeAspect="1"/>
@@ -3688,7 +3688,7 @@
                   <pic:spPr>
                     <a:xfrm>
                       <a:off x="0" y="0"/>
-                      <a:ext cx="5303520" cy="5099538"/>
+                      <a:ext cx="5303520" cy="5067167"/>
                     </a:xfrm>
                     <a:prstGeom prst="rect"/>
                   </pic:spPr>
@@ -4222,7 +4222,7 @@
       <w:r>
         <w:drawing>
           <wp:inline xmlns:a="http://schemas.openxmlformats.org/drawingml/2006/main" xmlns:pic="http://schemas.openxmlformats.org/drawingml/2006/picture">
-            <wp:extent cx="5303520" cy="5775592"/>
+            <wp:extent cx="5303520" cy="4957638"/>
             <wp:docPr id="3" name="Picture 3"/>
             <wp:cNvGraphicFramePr>
               <a:graphicFrameLocks noChangeAspect="1"/>
@@ -4243,7 +4243,7 @@
                   <pic:spPr>
                     <a:xfrm>
                       <a:off x="0" y="0"/>
-                      <a:ext cx="5303520" cy="5775592"/>
+                      <a:ext cx="5303520" cy="4957638"/>
                     </a:xfrm>
                     <a:prstGeom prst="rect"/>
                   </pic:spPr>
@@ -6197,7 +6197,7 @@
       <w:r>
         <w:drawing>
           <wp:inline xmlns:a="http://schemas.openxmlformats.org/drawingml/2006/main" xmlns:pic="http://schemas.openxmlformats.org/drawingml/2006/picture">
-            <wp:extent cx="5303520" cy="7246283"/>
+            <wp:extent cx="5303520" cy="6109872"/>
             <wp:docPr id="4" name="Picture 4"/>
             <wp:cNvGraphicFramePr>
               <a:graphicFrameLocks noChangeAspect="1"/>
@@ -6218,7 +6218,7 @@
                   <pic:spPr>
                     <a:xfrm>
                       <a:off x="0" y="0"/>
-                      <a:ext cx="5303520" cy="7246283"/>
+                      <a:ext cx="5303520" cy="6109872"/>
                     </a:xfrm>
                     <a:prstGeom prst="rect"/>
                   </pic:spPr>
@@ -6844,7 +6844,7 @@
       <w:r>
         <w:drawing>
           <wp:inline xmlns:a="http://schemas.openxmlformats.org/drawingml/2006/main" xmlns:pic="http://schemas.openxmlformats.org/drawingml/2006/picture">
-            <wp:extent cx="5303520" cy="3161908"/>
+            <wp:extent cx="5303520" cy="3102059"/>
             <wp:docPr id="5" name="Picture 5"/>
             <wp:cNvGraphicFramePr>
               <a:graphicFrameLocks noChangeAspect="1"/>
@@ -6865,7 +6865,7 @@
                   <pic:spPr>
                     <a:xfrm>
                       <a:off x="0" y="0"/>
-                      <a:ext cx="5303520" cy="3161908"/>
+                      <a:ext cx="5303520" cy="3102059"/>
                     </a:xfrm>
                     <a:prstGeom prst="rect"/>
                   </pic:spPr>
@@ -7483,7 +7483,7 @@
       <w:r>
         <w:drawing>
           <wp:inline xmlns:a="http://schemas.openxmlformats.org/drawingml/2006/main" xmlns:pic="http://schemas.openxmlformats.org/drawingml/2006/picture">
-            <wp:extent cx="2560320" cy="4514523"/>
+            <wp:extent cx="2560320" cy="4667250"/>
             <wp:docPr id="6" name="Picture 6"/>
             <wp:cNvGraphicFramePr>
               <a:graphicFrameLocks noChangeAspect="1"/>
@@ -7504,7 +7504,7 @@
                   <pic:spPr>
                     <a:xfrm>
                       <a:off x="0" y="0"/>
-                      <a:ext cx="2560320" cy="4514523"/>
+                      <a:ext cx="2560320" cy="4667250"/>
                     </a:xfrm>
                     <a:prstGeom prst="rect"/>
                   </pic:spPr>
@@ -7977,7 +7977,7 @@
       <w:r>
         <w:drawing>
           <wp:inline xmlns:a="http://schemas.openxmlformats.org/drawingml/2006/main" xmlns:pic="http://schemas.openxmlformats.org/drawingml/2006/picture">
-            <wp:extent cx="5303520" cy="8137767"/>
+            <wp:extent cx="5303520" cy="6257025"/>
             <wp:docPr id="7" name="Picture 7"/>
             <wp:cNvGraphicFramePr>
               <a:graphicFrameLocks noChangeAspect="1"/>
@@ -7998,7 +7998,7 @@
                   <pic:spPr>
                     <a:xfrm>
                       <a:off x="0" y="0"/>
-                      <a:ext cx="5303520" cy="8137767"/>
+                      <a:ext cx="5303520" cy="6257025"/>
                     </a:xfrm>
                     <a:prstGeom prst="rect"/>
                   </pic:spPr>
@@ -9055,7 +9055,7 @@
       <w:r>
         <w:drawing>
           <wp:inline xmlns:a="http://schemas.openxmlformats.org/drawingml/2006/main" xmlns:pic="http://schemas.openxmlformats.org/drawingml/2006/picture">
-            <wp:extent cx="5303520" cy="9874389"/>
+            <wp:extent cx="5303520" cy="7587281"/>
             <wp:docPr id="8" name="Picture 8"/>
             <wp:cNvGraphicFramePr>
               <a:graphicFrameLocks noChangeAspect="1"/>
@@ -9076,7 +9076,7 @@
                   <pic:spPr>
                     <a:xfrm>
                       <a:off x="0" y="0"/>
-                      <a:ext cx="5303520" cy="9874389"/>
+                      <a:ext cx="5303520" cy="7587281"/>
                     </a:xfrm>
                     <a:prstGeom prst="rect"/>
                   </pic:spPr>

</xml_diff>